<commit_message>
Frontend implementation ; feat: implement authentication system with API client, AuthProvider, and onboarding/dashboard routing
</commit_message>
<xml_diff>
--- a/apps/api/app/resume-templates/Template1.docx
+++ b/apps/api/app/resume-templates/Template1.docx
@@ -164,36 +164,6 @@
           <w:sz w:val="22"/>
         </w:rPr>
       </w:pPr>
-    </w:p>
-    <w:p>
-      <w:pPr>
-        <w:pStyle w:val="Heading1"/>
-        <w:pBdr>
-          <w:bottom w:val="single" w:sz="4" w:space="1" w:color="auto"/>
-        </w:pBdr>
-      </w:pPr>
-      <w:r>
-        <w:rPr>
-          <w:spacing w:val="-2"/>
-          <w:w w:val="115"/>
-        </w:rPr>
-        <w:t>Summary</w:t>
-      </w:r>
-    </w:p>
-    <w:p>
-      <w:pPr>
-        <w:pStyle w:val="BodyText"/>
-        <w:spacing w:after="40"/>
-        <w:ind w:left="180" w:right="187"/>
-        <w:jc w:val="both"/>
-        <w:rPr>
-          <w:sz w:val="2"/>
-          <w:szCs w:val="2"/>
-        </w:rPr>
-      </w:pPr>
-      <w:r>
-        <w:t>{{summary}}</w:t>
-      </w:r>
     </w:p>
     <w:p>
       <w:pPr>
@@ -514,7 +484,13 @@
               <w:rPr>
                 <w:bCs/>
               </w:rPr>
-              <w:t>.start</w:t>
+              <w:t>.</w:t>
+            </w:r>
+            <w:r>
+              <w:rPr>
+                <w:bCs/>
+              </w:rPr>
+              <w:t>from</w:t>
             </w:r>
             <w:proofErr w:type="spellEnd"/>
             <w:r>
@@ -523,7 +499,6 @@
               </w:rPr>
               <w:t xml:space="preserve"> }} – {{ </w:t>
             </w:r>
-            <w:proofErr w:type="spellStart"/>
             <w:r>
               <w:rPr>
                 <w:bCs/>
@@ -534,9 +509,14 @@
               <w:rPr>
                 <w:bCs/>
               </w:rPr>
-              <w:t>.end</w:t>
-            </w:r>
-            <w:proofErr w:type="spellEnd"/>
+              <w:t>.</w:t>
+            </w:r>
+            <w:r>
+              <w:rPr>
+                <w:bCs/>
+              </w:rPr>
+              <w:t>to</w:t>
+            </w:r>
             <w:r>
               <w:rPr>
                 <w:bCs/>

</xml_diff>